<commit_message>
docs(report): update the report and its cover rule
Co-Authored-By: Claude Opus 5.5 <noreply@anthropic.com>
</commit_message>
<xml_diff>
--- a/docs/report/report.docx
+++ b/docs/report/report.docx
@@ -114,7 +114,7 @@
     <w:p>
       <w:pPr>
         <w:pStyle w:val="55"/>
-        <w:spacing w:before="0" w:after="240"/>
+        <w:spacing w:before="0" w:after="720"/>
         <w:jc w:val="center"/>
       </w:pPr>
       <w:r>
@@ -125,92 +125,6 @@
           <w:szCs w:val="36"/>
         </w:rPr>
         <w:t>TRÊN CÁC WEBSITE ĐẠI HỌC BÁCH KHOA HÀ NỘI</w:t>
-      </w:r>
-    </w:p>
-    <w:p>
-      <w:pPr>
-        <w:pStyle w:val="55"/>
-        <w:spacing w:before="0" w:after="240"/>
-        <w:jc w:val="center"/>
-      </w:pPr>
-      <w:r>
-        <w:t>Học phần IT4863: Tìm kiếm thông tin</w:t>
-      </w:r>
-    </w:p>
-    <w:tbl>
-      <w:tblPr>
-        <w:tblStyle w:val="13"/>
-        <w:tblW w:w="7200" w:type="dxa"/>
-        <w:jc w:val="center"/>
-        <w:tblBorders>
-          <w:top w:val="none" w:color="auto" w:sz="0" w:space="0"/>
-          <w:left w:val="none" w:color="auto" w:sz="0" w:space="0"/>
-          <w:bottom w:val="none" w:color="auto" w:sz="0" w:space="0"/>
-          <w:right w:val="none" w:color="auto" w:sz="0" w:space="0"/>
-          <w:insideH w:val="none" w:color="auto" w:sz="0" w:space="0"/>
-          <w:insideV w:val="none" w:color="auto" w:sz="0" w:space="0"/>
-        </w:tblBorders>
-        <w:tblLayout w:type="fixed"/>
-        <w:tblCellMar>
-          <w:top w:w="0" w:type="dxa"/>
-          <w:left w:w="108" w:type="dxa"/>
-          <w:bottom w:w="0" w:type="dxa"/>
-          <w:right w:w="108" w:type="dxa"/>
-        </w:tblCellMar>
-      </w:tblPr>
-      <w:tblGrid>
-        <w:gridCol w:w="3000"/>
-        <w:gridCol w:w="4200"/>
-      </w:tblGrid>
-      <w:tr>
-        <w:trPr>
-          <w:jc w:val="center"/>
-        </w:trPr>
-        <w:tc>
-          <w:tcPr>
-            <w:tcW w:w="3000" w:type="dxa"/>
-          </w:tcPr>
-          <w:p>
-            <w:pPr>
-              <w:pStyle w:val="27"/>
-              <w:spacing w:before="60" w:after="60"/>
-            </w:pPr>
-            <w:r>
-              <w:rPr>
-                <w:b/>
-              </w:rPr>
-              <w:t>Giảng viên hướng dẫn:</w:t>
-            </w:r>
-          </w:p>
-        </w:tc>
-        <w:tc>
-          <w:tcPr>
-            <w:tcW w:w="4200" w:type="dxa"/>
-          </w:tcPr>
-          <w:p>
-            <w:pPr>
-              <w:pStyle w:val="27"/>
-              <w:spacing w:before="60" w:after="60"/>
-            </w:pPr>
-            <w:r>
-              <w:t>TS. Nguyễn Bá Ngọc</w:t>
-            </w:r>
-          </w:p>
-        </w:tc>
-      </w:tr>
-    </w:tbl>
-    <w:p>
-      <w:pPr>
-        <w:pStyle w:val="55"/>
-        <w:spacing w:before="240" w:after="120"/>
-        <w:jc w:val="center"/>
-      </w:pPr>
-      <w:r>
-        <w:rPr>
-          <w:b/>
-          <w:bCs/>
-        </w:rPr>
-        <w:t>Nhóm sinh viên thực hiện: Nhóm BAT</w:t>
       </w:r>
     </w:p>
     <w:tbl>
@@ -235,9 +149,8 @@
         </w:tblCellMar>
       </w:tblPr>
       <w:tblGrid>
-        <w:gridCol w:w="900"/>
-        <w:gridCol w:w="3800"/>
-        <w:gridCol w:w="2500"/>
+        <w:gridCol w:w="3700"/>
+        <w:gridCol w:w="3500"/>
       </w:tblGrid>
       <w:tr>
         <w:trPr>
@@ -246,7 +159,24 @@
         </w:trPr>
         <w:tc>
           <w:tcPr>
-            <w:tcW w:w="900" w:type="dxa"/>
+            <w:tcW w:w="3700" w:type="dxa"/>
+          </w:tcPr>
+          <w:p>
+            <w:pPr>
+              <w:pStyle w:val="27"/>
+              <w:spacing w:before="60" w:after="60"/>
+            </w:pPr>
+            <w:r>
+              <w:rPr>
+                <w:b/>
+              </w:rPr>
+              <w:t>Học phần</w:t>
+            </w:r>
+          </w:p>
+        </w:tc>
+        <w:tc>
+          <w:tcPr>
+            <w:tcW w:w="3500" w:type="dxa"/>
           </w:tcPr>
           <w:p>
             <w:pPr>
@@ -255,46 +185,7 @@
               <w:jc w:val="center"/>
             </w:pPr>
             <w:r>
-              <w:rPr>
-                <w:b/>
-              </w:rPr>
-              <w:t>STT</w:t>
-            </w:r>
-          </w:p>
-        </w:tc>
-        <w:tc>
-          <w:tcPr>
-            <w:tcW w:w="3800" w:type="dxa"/>
-          </w:tcPr>
-          <w:p>
-            <w:pPr>
-              <w:pStyle w:val="27"/>
-              <w:spacing w:before="60" w:after="60"/>
-              <w:jc w:val="center"/>
-            </w:pPr>
-            <w:r>
-              <w:rPr>
-                <w:b/>
-              </w:rPr>
-              <w:t>Họ và tên</w:t>
-            </w:r>
-          </w:p>
-        </w:tc>
-        <w:tc>
-          <w:tcPr>
-            <w:tcW w:w="2500" w:type="dxa"/>
-          </w:tcPr>
-          <w:p>
-            <w:pPr>
-              <w:pStyle w:val="27"/>
-              <w:spacing w:before="60" w:after="60"/>
-              <w:jc w:val="center"/>
-            </w:pPr>
-            <w:r>
-              <w:rPr>
-                <w:b/>
-              </w:rPr>
-              <w:t>Mã số sinh viên</w:t>
+              <w:t>IT4863: Tìm kiếm thông tin</w:t>
             </w:r>
           </w:p>
         </w:tc>
@@ -306,7 +197,24 @@
         </w:trPr>
         <w:tc>
           <w:tcPr>
-            <w:tcW w:w="900" w:type="dxa"/>
+            <w:tcW w:w="3700" w:type="dxa"/>
+          </w:tcPr>
+          <w:p>
+            <w:pPr>
+              <w:pStyle w:val="27"/>
+              <w:spacing w:before="60" w:after="60"/>
+            </w:pPr>
+            <w:r>
+              <w:rPr>
+                <w:b/>
+              </w:rPr>
+              <w:t>Giảng viên hướng dẫn</w:t>
+            </w:r>
+          </w:p>
+        </w:tc>
+        <w:tc>
+          <w:tcPr>
+            <w:tcW w:w="3500" w:type="dxa"/>
           </w:tcPr>
           <w:p>
             <w:pPr>
@@ -315,37 +223,7 @@
               <w:jc w:val="center"/>
             </w:pPr>
             <w:r>
-              <w:t>1</w:t>
-            </w:r>
-          </w:p>
-        </w:tc>
-        <w:tc>
-          <w:tcPr>
-            <w:tcW w:w="3800" w:type="dxa"/>
-          </w:tcPr>
-          <w:p>
-            <w:pPr>
-              <w:pStyle w:val="27"/>
-              <w:spacing w:before="60" w:after="60"/>
-              <w:jc w:val="center"/>
-            </w:pPr>
-            <w:r>
-              <w:t>Doãn Văn An</w:t>
-            </w:r>
-          </w:p>
-        </w:tc>
-        <w:tc>
-          <w:tcPr>
-            <w:tcW w:w="2500" w:type="dxa"/>
-          </w:tcPr>
-          <w:p>
-            <w:pPr>
-              <w:pStyle w:val="27"/>
-              <w:spacing w:before="60" w:after="60"/>
-              <w:jc w:val="center"/>
-            </w:pPr>
-            <w:r>
-              <w:t>20252778M</w:t>
+              <w:t>TS. Nguyễn Bá Ngọc</w:t>
             </w:r>
           </w:p>
         </w:tc>
@@ -357,7 +235,24 @@
         </w:trPr>
         <w:tc>
           <w:tcPr>
-            <w:tcW w:w="900" w:type="dxa"/>
+            <w:tcW w:w="3700" w:type="dxa"/>
+          </w:tcPr>
+          <w:p>
+            <w:pPr>
+              <w:pStyle w:val="27"/>
+              <w:spacing w:before="60" w:after="60"/>
+            </w:pPr>
+            <w:r>
+              <w:rPr>
+                <w:b/>
+              </w:rPr>
+              <w:t>Nhóm</w:t>
+            </w:r>
+          </w:p>
+        </w:tc>
+        <w:tc>
+          <w:tcPr>
+            <w:tcW w:w="3500" w:type="dxa"/>
           </w:tcPr>
           <w:p>
             <w:pPr>
@@ -366,53 +261,7 @@
               <w:jc w:val="center"/>
             </w:pPr>
             <w:r>
-              <w:t>2</w:t>
-            </w:r>
-          </w:p>
-        </w:tc>
-        <w:tc>
-          <w:tcPr>
-            <w:tcW w:w="3800" w:type="dxa"/>
-          </w:tcPr>
-          <w:p>
-            <w:pPr>
-              <w:pStyle w:val="27"/>
-              <w:spacing w:before="60" w:after="60"/>
-              <w:jc w:val="center"/>
-              <w:rPr>
-                <w:rFonts w:hint="default"/>
-                <w:lang w:val="vi-VN"/>
-              </w:rPr>
-            </w:pPr>
-            <w:r>
-              <w:rPr>
-                <w:rFonts w:hint="default" w:ascii="Times New Roman"/>
-                <w:lang w:val="vi-VN"/>
-              </w:rPr>
-              <w:t>Trần Ngọc Bảo</w:t>
-            </w:r>
-          </w:p>
-        </w:tc>
-        <w:tc>
-          <w:tcPr>
-            <w:tcW w:w="2500" w:type="dxa"/>
-          </w:tcPr>
-          <w:p>
-            <w:pPr>
-              <w:pStyle w:val="27"/>
-              <w:spacing w:before="60" w:after="60"/>
-              <w:jc w:val="center"/>
-              <w:rPr>
-                <w:rFonts w:hint="default"/>
-                <w:lang w:val="vi-VN"/>
-              </w:rPr>
-            </w:pPr>
-            <w:r>
-              <w:rPr>
-                <w:rFonts w:hint="default" w:ascii="Times New Roman"/>
-                <w:lang w:val="vi-VN"/>
-              </w:rPr>
-              <w:t>20251227M</w:t>
+              <w:t>BAT</w:t>
             </w:r>
           </w:p>
         </w:tc>
@@ -424,7 +273,24 @@
         </w:trPr>
         <w:tc>
           <w:tcPr>
-            <w:tcW w:w="900" w:type="dxa"/>
+            <w:tcW w:w="3700" w:type="dxa"/>
+          </w:tcPr>
+          <w:p>
+            <w:pPr>
+              <w:pStyle w:val="27"/>
+              <w:spacing w:before="60" w:after="60"/>
+            </w:pPr>
+            <w:r>
+              <w:rPr>
+                <w:b/>
+              </w:rPr>
+              <w:t>Họ và tên</w:t>
+            </w:r>
+          </w:p>
+        </w:tc>
+        <w:tc>
+          <w:tcPr>
+            <w:tcW w:w="3500" w:type="dxa"/>
           </w:tcPr>
           <w:p>
             <w:pPr>
@@ -433,19 +299,62 @@
               <w:jc w:val="center"/>
             </w:pPr>
             <w:r>
-              <w:t>3</w:t>
-            </w:r>
-          </w:p>
-        </w:tc>
-        <w:tc>
-          <w:tcPr>
-            <w:tcW w:w="3800" w:type="dxa"/>
+              <w:rPr>
+                <w:b/>
+              </w:rPr>
+              <w:t>Mã số học viên</w:t>
+            </w:r>
+          </w:p>
+        </w:tc>
+      </w:tr>
+      <w:tr>
+        <w:trPr>
+          <w:trHeight w:val="440" w:hRule="atLeast"/>
+          <w:jc w:val="center"/>
+        </w:trPr>
+        <w:tc>
+          <w:tcPr>
+            <w:tcW w:w="3700" w:type="dxa"/>
+          </w:tcPr>
+          <w:p>
+            <w:pPr>
+              <w:pStyle w:val="27"/>
+              <w:spacing w:before="60" w:after="60"/>
+            </w:pPr>
+            <w:r>
+              <w:t>Doãn Văn An</w:t>
+            </w:r>
+          </w:p>
+        </w:tc>
+        <w:tc>
+          <w:tcPr>
+            <w:tcW w:w="3500" w:type="dxa"/>
           </w:tcPr>
           <w:p>
             <w:pPr>
               <w:pStyle w:val="27"/>
               <w:spacing w:before="60" w:after="60"/>
               <w:jc w:val="center"/>
+            </w:pPr>
+            <w:r>
+              <w:t>20252778M</w:t>
+            </w:r>
+          </w:p>
+        </w:tc>
+      </w:tr>
+      <w:tr>
+        <w:trPr>
+          <w:trHeight w:val="440" w:hRule="atLeast"/>
+          <w:jc w:val="center"/>
+        </w:trPr>
+        <w:tc>
+          <w:tcPr>
+            <w:tcW w:w="3700" w:type="dxa"/>
+          </w:tcPr>
+          <w:p>
+            <w:pPr>
+              <w:pStyle w:val="27"/>
+              <w:spacing w:before="60" w:after="60"/>
               <w:rPr>
                 <w:rFonts w:hint="default"/>
                 <w:lang w:val="vi-VN"/>
@@ -456,13 +365,64 @@
                 <w:rFonts w:hint="default" w:ascii="Times New Roman"/>
                 <w:lang w:val="vi-VN"/>
               </w:rPr>
+              <w:t>Trần Ngọc Bảo</w:t>
+            </w:r>
+          </w:p>
+        </w:tc>
+        <w:tc>
+          <w:tcPr>
+            <w:tcW w:w="3500" w:type="dxa"/>
+          </w:tcPr>
+          <w:p>
+            <w:pPr>
+              <w:pStyle w:val="27"/>
+              <w:spacing w:before="60" w:after="60"/>
+              <w:jc w:val="center"/>
+              <w:rPr>
+                <w:rFonts w:hint="default"/>
+                <w:lang w:val="vi-VN"/>
+              </w:rPr>
+            </w:pPr>
+            <w:r>
+              <w:rPr>
+                <w:rFonts w:hint="default" w:ascii="Times New Roman"/>
+                <w:lang w:val="vi-VN"/>
+              </w:rPr>
+              <w:t>20251227M</w:t>
+            </w:r>
+          </w:p>
+        </w:tc>
+      </w:tr>
+      <w:tr>
+        <w:trPr>
+          <w:trHeight w:val="440" w:hRule="atLeast"/>
+          <w:jc w:val="center"/>
+        </w:trPr>
+        <w:tc>
+          <w:tcPr>
+            <w:tcW w:w="3700" w:type="dxa"/>
+          </w:tcPr>
+          <w:p>
+            <w:pPr>
+              <w:pStyle w:val="27"/>
+              <w:spacing w:before="60" w:after="60"/>
+              <w:rPr>
+                <w:rFonts w:hint="default"/>
+                <w:lang w:val="vi-VN"/>
+              </w:rPr>
+            </w:pPr>
+            <w:r>
+              <w:rPr>
+                <w:rFonts w:hint="default" w:ascii="Times New Roman"/>
+                <w:lang w:val="vi-VN"/>
+              </w:rPr>
               <w:t>Phạm Sơn Tùng</w:t>
             </w:r>
           </w:p>
         </w:tc>
         <w:tc>
           <w:tcPr>
-            <w:tcW w:w="2500" w:type="dxa"/>
+            <w:tcW w:w="3500" w:type="dxa"/>
           </w:tcPr>
           <w:p>
             <w:pPr>

</xml_diff>

<commit_message>
docs: new PageRank and duplicate hiding in the report and slides
The report describes PageRank without boilerplate links, adds section
3.4 and figure 13 on hiding duplicate results, and table 10 measuring
it on 20 queries (copies of the same article in the top 10: 29 to 0).
The slides gain a duplicate hiding slide and the updated figures.
</commit_message>
<xml_diff>
--- a/docs/report/report.docx
+++ b/docs/report/report.docx
@@ -1066,6 +1066,47 @@
     </w:p>
     <w:p>
       <w:pPr>
+        <w:pStyle w:val="25"/>
+        <w:tabs>
+          <w:tab w:val="right" w:leader="dot" w:pos="9355"/>
+        </w:tabs>
+      </w:pPr>
+      <w:r>
+        <w:fldChar w:fldCharType="begin"/>
+      </w:r>
+      <w:r>
+        <w:instrText xml:space="preserve"> HYPERLINK \l _Toc9300034 </w:instrText>
+      </w:r>
+      <w:r>
+        <w:fldChar w:fldCharType="separate"/>
+      </w:r>
+      <w:r>
+        <w:t>3.4. Ẩn kết quả trùng lặp</w:t>
+      </w:r>
+      <w:r>
+        <w:tab/>
+      </w:r>
+      <w:r>
+        <w:fldChar w:fldCharType="begin"/>
+      </w:r>
+      <w:r>
+        <w:instrText xml:space="preserve"> PAGEREF _Toc9300034 \h </w:instrText>
+      </w:r>
+      <w:r>
+        <w:fldChar w:fldCharType="separate"/>
+      </w:r>
+      <w:r>
+        <w:t>15</w:t>
+      </w:r>
+      <w:r>
+        <w:fldChar w:fldCharType="end"/>
+      </w:r>
+      <w:r>
+        <w:fldChar w:fldCharType="end"/>
+      </w:r>
+    </w:p>
+    <w:p>
+      <w:pPr>
         <w:pStyle w:val="24"/>
         <w:tabs>
           <w:tab w:val="right" w:leader="dot" w:pos="9355"/>
@@ -1638,19 +1679,39 @@
         <w:tabs>
           <w:tab w:val="right" w:leader="dot" w:pos="9355"/>
         </w:tabs>
-        <w:spacing w:before="40" w:after="40"/>
-      </w:pPr>
-      <w:r>
-        <w:fldChar w:fldCharType="end"/>
-      </w:r>
-    </w:p>
-    <w:p>
-      <w:pPr>
-        <w:pStyle w:val="54"/>
-        <w:spacing w:before="120" w:after="120"/>
-      </w:pPr>
-      <w:r>
-        <w:t>Danh mục hình</w:t>
+      </w:pPr>
+      <w:r>
+        <w:fldChar w:fldCharType="begin"/>
+      </w:r>
+      <w:r>
+        <w:instrText xml:space="preserve"> HYPERLINK \l _Toc9300010 </w:instrText>
+      </w:r>
+      <w:r>
+        <w:fldChar w:fldCharType="separate"/>
+      </w:r>
+      <w:r>
+        <w:t>Bảng 10 . Kết quả trùng lặp trong top 10 của 20 truy vấn</w:t>
+      </w:r>
+      <w:r>
+        <w:tab/>
+      </w:r>
+      <w:r>
+        <w:fldChar w:fldCharType="begin"/>
+      </w:r>
+      <w:r>
+        <w:instrText xml:space="preserve"> PAGEREF _Toc9300010 \h </w:instrText>
+      </w:r>
+      <w:r>
+        <w:fldChar w:fldCharType="separate"/>
+      </w:r>
+      <w:r>
+        <w:t>18</w:t>
+      </w:r>
+      <w:r>
+        <w:fldChar w:fldCharType="end"/>
+      </w:r>
+      <w:r>
+        <w:fldChar w:fldCharType="end"/>
       </w:r>
     </w:p>
     <w:p>
@@ -1659,48 +1720,19 @@
         <w:tabs>
           <w:tab w:val="right" w:leader="dot" w:pos="9355"/>
         </w:tabs>
-      </w:pPr>
-      <w:r>
-        <w:fldChar w:fldCharType="begin"/>
-      </w:r>
-      <w:r>
-        <w:instrText xml:space="preserve"> TOC \h \z \c "Hình" </w:instrText>
-      </w:r>
-      <w:r>
-        <w:fldChar w:fldCharType="separate"/>
-      </w:r>
-      <w:r>
-        <w:fldChar w:fldCharType="begin"/>
-      </w:r>
-      <w:r>
-        <w:instrText xml:space="preserve"> HYPERLINK \l _Toc1768504840 </w:instrText>
-      </w:r>
-      <w:r>
-        <w:fldChar w:fldCharType="separate"/>
-      </w:r>
-      <w:r>
-        <w:t>Hình 1 . Công nghệ sử dụng theo từng khối</w:t>
-      </w:r>
-      <w:r>
-        <w:tab/>
-      </w:r>
-      <w:r>
-        <w:fldChar w:fldCharType="begin"/>
-      </w:r>
-      <w:r>
-        <w:instrText xml:space="preserve"> PAGEREF _Toc1768504840 \h </w:instrText>
-      </w:r>
-      <w:r>
-        <w:fldChar w:fldCharType="separate"/>
-      </w:r>
-      <w:r>
-        <w:t>4</w:t>
-      </w:r>
-      <w:r>
-        <w:fldChar w:fldCharType="end"/>
-      </w:r>
-      <w:r>
-        <w:fldChar w:fldCharType="end"/>
+        <w:spacing w:before="40" w:after="40"/>
+      </w:pPr>
+      <w:r>
+        <w:fldChar w:fldCharType="end"/>
+      </w:r>
+    </w:p>
+    <w:p>
+      <w:pPr>
+        <w:pStyle w:val="54"/>
+        <w:spacing w:before="120" w:after="120"/>
+      </w:pPr>
+      <w:r>
+        <w:t>Danh mục hình</w:t>
       </w:r>
     </w:p>
     <w:p>
@@ -1714,13 +1746,22 @@
         <w:fldChar w:fldCharType="begin"/>
       </w:r>
       <w:r>
-        <w:instrText xml:space="preserve"> HYPERLINK \l _Toc2091829702 </w:instrText>
-      </w:r>
-      <w:r>
-        <w:fldChar w:fldCharType="separate"/>
-      </w:r>
-      <w:r>
-        <w:t>Hình 2 . Kiến trúc hệ thống thu thập theo mô hình dịch vụ nhỏ</w:t>
+        <w:instrText xml:space="preserve"> TOC \h \z \c "Hình" </w:instrText>
+      </w:r>
+      <w:r>
+        <w:fldChar w:fldCharType="separate"/>
+      </w:r>
+      <w:r>
+        <w:fldChar w:fldCharType="begin"/>
+      </w:r>
+      <w:r>
+        <w:instrText xml:space="preserve"> HYPERLINK \l _Toc1768504840 </w:instrText>
+      </w:r>
+      <w:r>
+        <w:fldChar w:fldCharType="separate"/>
+      </w:r>
+      <w:r>
+        <w:t>Hình 1 . Công nghệ sử dụng theo từng khối</w:t>
       </w:r>
       <w:r>
         <w:tab/>
@@ -1729,13 +1770,13 @@
         <w:fldChar w:fldCharType="begin"/>
       </w:r>
       <w:r>
-        <w:instrText xml:space="preserve"> PAGEREF _Toc2091829702 \h </w:instrText>
-      </w:r>
-      <w:r>
-        <w:fldChar w:fldCharType="separate"/>
-      </w:r>
-      <w:r>
-        <w:t>5</w:t>
+        <w:instrText xml:space="preserve"> PAGEREF _Toc1768504840 \h </w:instrText>
+      </w:r>
+      <w:r>
+        <w:fldChar w:fldCharType="separate"/>
+      </w:r>
+      <w:r>
+        <w:t>4</w:t>
       </w:r>
       <w:r>
         <w:fldChar w:fldCharType="end"/>
@@ -1755,13 +1796,13 @@
         <w:fldChar w:fldCharType="begin"/>
       </w:r>
       <w:r>
-        <w:instrText xml:space="preserve"> HYPERLINK \l _Toc372069954 </w:instrText>
-      </w:r>
-      <w:r>
-        <w:fldChar w:fldCharType="separate"/>
-      </w:r>
-      <w:r>
-        <w:t>Hình 3 . Mediator, Downloader và lập lịch thu thập lại</w:t>
+        <w:instrText xml:space="preserve"> HYPERLINK \l _Toc2091829702 </w:instrText>
+      </w:r>
+      <w:r>
+        <w:fldChar w:fldCharType="separate"/>
+      </w:r>
+      <w:r>
+        <w:t>Hình 2 . Kiến trúc hệ thống thu thập theo mô hình dịch vụ nhỏ</w:t>
       </w:r>
       <w:r>
         <w:tab/>
@@ -1770,13 +1811,13 @@
         <w:fldChar w:fldCharType="begin"/>
       </w:r>
       <w:r>
-        <w:instrText xml:space="preserve"> PAGEREF _Toc372069954 \h </w:instrText>
-      </w:r>
-      <w:r>
-        <w:fldChar w:fldCharType="separate"/>
-      </w:r>
-      <w:r>
-        <w:t>6</w:t>
+        <w:instrText xml:space="preserve"> PAGEREF _Toc2091829702 \h </w:instrText>
+      </w:r>
+      <w:r>
+        <w:fldChar w:fldCharType="separate"/>
+      </w:r>
+      <w:r>
+        <w:t>5</w:t>
       </w:r>
       <w:r>
         <w:fldChar w:fldCharType="end"/>
@@ -1796,13 +1837,13 @@
         <w:fldChar w:fldCharType="begin"/>
       </w:r>
       <w:r>
-        <w:instrText xml:space="preserve"> HYPERLINK \l _Toc1682960620 </w:instrText>
-      </w:r>
-      <w:r>
-        <w:fldChar w:fldCharType="separate"/>
-      </w:r>
-      <w:r>
-        <w:t>Hình 4 . Luồng bóc tách của Reader: HTML, PDF, Office, OCR</w:t>
+        <w:instrText xml:space="preserve"> HYPERLINK \l _Toc372069954 </w:instrText>
+      </w:r>
+      <w:r>
+        <w:fldChar w:fldCharType="separate"/>
+      </w:r>
+      <w:r>
+        <w:t>Hình 3 . Mediator, Downloader và lập lịch thu thập lại</w:t>
       </w:r>
       <w:r>
         <w:tab/>
@@ -1811,13 +1852,13 @@
         <w:fldChar w:fldCharType="begin"/>
       </w:r>
       <w:r>
-        <w:instrText xml:space="preserve"> PAGEREF _Toc1682960620 \h </w:instrText>
-      </w:r>
-      <w:r>
-        <w:fldChar w:fldCharType="separate"/>
-      </w:r>
-      <w:r>
-        <w:t>7</w:t>
+        <w:instrText xml:space="preserve"> PAGEREF _Toc372069954 \h </w:instrText>
+      </w:r>
+      <w:r>
+        <w:fldChar w:fldCharType="separate"/>
+      </w:r>
+      <w:r>
+        <w:t>6</w:t>
       </w:r>
       <w:r>
         <w:fldChar w:fldCharType="end"/>
@@ -1837,13 +1878,13 @@
         <w:fldChar w:fldCharType="begin"/>
       </w:r>
       <w:r>
-        <w:instrText xml:space="preserve"> HYPERLINK \l _Toc1045506081 </w:instrText>
-      </w:r>
-      <w:r>
-        <w:fldChar w:fldCharType="separate"/>
-      </w:r>
-      <w:r>
-        <w:t>Hình 5 . Thuật toán tìm khối nội dung và bóc tách bản ghi trang web</w:t>
+        <w:instrText xml:space="preserve"> HYPERLINK \l _Toc1682960620 </w:instrText>
+      </w:r>
+      <w:r>
+        <w:fldChar w:fldCharType="separate"/>
+      </w:r>
+      <w:r>
+        <w:t>Hình 4 . Luồng bóc tách của Reader: HTML, PDF, Office, OCR</w:t>
       </w:r>
       <w:r>
         <w:tab/>
@@ -1852,13 +1893,13 @@
         <w:fldChar w:fldCharType="begin"/>
       </w:r>
       <w:r>
-        <w:instrText xml:space="preserve"> PAGEREF _Toc1045506081 \h </w:instrText>
-      </w:r>
-      <w:r>
-        <w:fldChar w:fldCharType="separate"/>
-      </w:r>
-      <w:r>
-        <w:t>8</w:t>
+        <w:instrText xml:space="preserve"> PAGEREF _Toc1682960620 \h </w:instrText>
+      </w:r>
+      <w:r>
+        <w:fldChar w:fldCharType="separate"/>
+      </w:r>
+      <w:r>
+        <w:t>7</w:t>
       </w:r>
       <w:r>
         <w:fldChar w:fldCharType="end"/>
@@ -1878,13 +1919,13 @@
         <w:fldChar w:fldCharType="begin"/>
       </w:r>
       <w:r>
-        <w:instrText xml:space="preserve"> HYPERLINK \l _Toc826716790 </w:instrText>
-      </w:r>
-      <w:r>
-        <w:fldChar w:fldCharType="separate"/>
-      </w:r>
-      <w:r>
-        <w:t>Hình 6 . Luồng xử lý của Merger</w:t>
+        <w:instrText xml:space="preserve"> HYPERLINK \l _Toc1045506081 </w:instrText>
+      </w:r>
+      <w:r>
+        <w:fldChar w:fldCharType="separate"/>
+      </w:r>
+      <w:r>
+        <w:t>Hình 5 . Thuật toán tìm khối nội dung và bóc tách bản ghi trang web</w:t>
       </w:r>
       <w:r>
         <w:tab/>
@@ -1893,13 +1934,13 @@
         <w:fldChar w:fldCharType="begin"/>
       </w:r>
       <w:r>
-        <w:instrText xml:space="preserve"> PAGEREF _Toc826716790 \h </w:instrText>
-      </w:r>
-      <w:r>
-        <w:fldChar w:fldCharType="separate"/>
-      </w:r>
-      <w:r>
-        <w:t>9</w:t>
+        <w:instrText xml:space="preserve"> PAGEREF _Toc1045506081 \h </w:instrText>
+      </w:r>
+      <w:r>
+        <w:fldChar w:fldCharType="separate"/>
+      </w:r>
+      <w:r>
+        <w:t>8</w:t>
       </w:r>
       <w:r>
         <w:fldChar w:fldCharType="end"/>
@@ -1919,13 +1960,13 @@
         <w:fldChar w:fldCharType="begin"/>
       </w:r>
       <w:r>
-        <w:instrText xml:space="preserve"> HYPERLINK \l _Toc2098990151 </w:instrText>
-      </w:r>
-      <w:r>
-        <w:fldChar w:fldCharType="separate"/>
-      </w:r>
-      <w:r>
-        <w:t>Hình 7 . Luồng xử lý của Storage và bước tải ảnh</w:t>
+        <w:instrText xml:space="preserve"> HYPERLINK \l _Toc826716790 </w:instrText>
+      </w:r>
+      <w:r>
+        <w:fldChar w:fldCharType="separate"/>
+      </w:r>
+      <w:r>
+        <w:t>Hình 6 . Luồng xử lý của Merger</w:t>
       </w:r>
       <w:r>
         <w:tab/>
@@ -1934,13 +1975,13 @@
         <w:fldChar w:fldCharType="begin"/>
       </w:r>
       <w:r>
-        <w:instrText xml:space="preserve"> PAGEREF _Toc2098990151 \h </w:instrText>
-      </w:r>
-      <w:r>
-        <w:fldChar w:fldCharType="separate"/>
-      </w:r>
-      <w:r>
-        <w:t>10</w:t>
+        <w:instrText xml:space="preserve"> PAGEREF _Toc826716790 \h </w:instrText>
+      </w:r>
+      <w:r>
+        <w:fldChar w:fldCharType="separate"/>
+      </w:r>
+      <w:r>
+        <w:t>9</w:t>
       </w:r>
       <w:r>
         <w:fldChar w:fldCharType="end"/>
@@ -1960,13 +2001,13 @@
         <w:fldChar w:fldCharType="begin"/>
       </w:r>
       <w:r>
-        <w:instrText xml:space="preserve"> HYPERLINK \l _Toc1711180512 </w:instrText>
-      </w:r>
-      <w:r>
-        <w:fldChar w:fldCharType="separate"/>
-      </w:r>
-      <w:r>
-        <w:t>Hình 8 . Lược đồ MongoDB và quy trình xuất dữ liệu</w:t>
+        <w:instrText xml:space="preserve"> HYPERLINK \l _Toc2098990151 </w:instrText>
+      </w:r>
+      <w:r>
+        <w:fldChar w:fldCharType="separate"/>
+      </w:r>
+      <w:r>
+        <w:t>Hình 7 . Luồng xử lý của Storage và bước tải ảnh</w:t>
       </w:r>
       <w:r>
         <w:tab/>
@@ -1975,13 +2016,13 @@
         <w:fldChar w:fldCharType="begin"/>
       </w:r>
       <w:r>
-        <w:instrText xml:space="preserve"> PAGEREF _Toc1711180512 \h </w:instrText>
-      </w:r>
-      <w:r>
-        <w:fldChar w:fldCharType="separate"/>
-      </w:r>
-      <w:r>
-        <w:t>11</w:t>
+        <w:instrText xml:space="preserve"> PAGEREF _Toc2098990151 \h </w:instrText>
+      </w:r>
+      <w:r>
+        <w:fldChar w:fldCharType="separate"/>
+      </w:r>
+      <w:r>
+        <w:t>10</w:t>
       </w:r>
       <w:r>
         <w:fldChar w:fldCharType="end"/>
@@ -2001,13 +2042,13 @@
         <w:fldChar w:fldCharType="begin"/>
       </w:r>
       <w:r>
-        <w:instrText xml:space="preserve"> HYPERLINK \l _Toc1422000835 </w:instrText>
-      </w:r>
-      <w:r>
-        <w:fldChar w:fldCharType="separate"/>
-      </w:r>
-      <w:r>
-        <w:t>Hình 9 . Kiến trúc hệ thống tìm kiếm Lucene</w:t>
+        <w:instrText xml:space="preserve"> HYPERLINK \l _Toc1711180512 </w:instrText>
+      </w:r>
+      <w:r>
+        <w:fldChar w:fldCharType="separate"/>
+      </w:r>
+      <w:r>
+        <w:t>Hình 8 . Lược đồ MongoDB và quy trình xuất dữ liệu</w:t>
       </w:r>
       <w:r>
         <w:tab/>
@@ -2016,13 +2057,13 @@
         <w:fldChar w:fldCharType="begin"/>
       </w:r>
       <w:r>
-        <w:instrText xml:space="preserve"> PAGEREF _Toc1422000835 \h </w:instrText>
-      </w:r>
-      <w:r>
-        <w:fldChar w:fldCharType="separate"/>
-      </w:r>
-      <w:r>
-        <w:t>12</w:t>
+        <w:instrText xml:space="preserve"> PAGEREF _Toc1711180512 \h </w:instrText>
+      </w:r>
+      <w:r>
+        <w:fldChar w:fldCharType="separate"/>
+      </w:r>
+      <w:r>
+        <w:t>11</w:t>
       </w:r>
       <w:r>
         <w:fldChar w:fldCharType="end"/>
@@ -2042,13 +2083,13 @@
         <w:fldChar w:fldCharType="begin"/>
       </w:r>
       <w:r>
-        <w:instrText xml:space="preserve"> HYPERLINK \l _Toc1231872847 </w:instrText>
-      </w:r>
-      <w:r>
-        <w:fldChar w:fldCharType="separate"/>
-      </w:r>
-      <w:r>
-        <w:t>Hình 10 . Chuỗi tiền xử lý văn bản tiếng Việt</w:t>
+        <w:instrText xml:space="preserve"> HYPERLINK \l _Toc1422000835 </w:instrText>
+      </w:r>
+      <w:r>
+        <w:fldChar w:fldCharType="separate"/>
+      </w:r>
+      <w:r>
+        <w:t>Hình 9 . Kiến trúc hệ thống tìm kiếm Lucene</w:t>
       </w:r>
       <w:r>
         <w:tab/>
@@ -2057,13 +2098,13 @@
         <w:fldChar w:fldCharType="begin"/>
       </w:r>
       <w:r>
-        <w:instrText xml:space="preserve"> PAGEREF _Toc1231872847 \h </w:instrText>
-      </w:r>
-      <w:r>
-        <w:fldChar w:fldCharType="separate"/>
-      </w:r>
-      <w:r>
-        <w:t>13</w:t>
+        <w:instrText xml:space="preserve"> PAGEREF _Toc1422000835 \h </w:instrText>
+      </w:r>
+      <w:r>
+        <w:fldChar w:fldCharType="separate"/>
+      </w:r>
+      <w:r>
+        <w:t>12</w:t>
       </w:r>
       <w:r>
         <w:fldChar w:fldCharType="end"/>
@@ -2083,13 +2124,13 @@
         <w:fldChar w:fldCharType="begin"/>
       </w:r>
       <w:r>
-        <w:instrText xml:space="preserve"> HYPERLINK \l _Toc1219781540 </w:instrText>
-      </w:r>
-      <w:r>
-        <w:fldChar w:fldCharType="separate"/>
-      </w:r>
-      <w:r>
-        <w:t>Hình 11 . Lập chỉ mục, đồng bộ và tính PageRank</w:t>
+        <w:instrText xml:space="preserve"> HYPERLINK \l _Toc1231872847 </w:instrText>
+      </w:r>
+      <w:r>
+        <w:fldChar w:fldCharType="separate"/>
+      </w:r>
+      <w:r>
+        <w:t>Hình 10 . Chuỗi tiền xử lý văn bản tiếng Việt</w:t>
       </w:r>
       <w:r>
         <w:tab/>
@@ -2098,13 +2139,13 @@
         <w:fldChar w:fldCharType="begin"/>
       </w:r>
       <w:r>
-        <w:instrText xml:space="preserve"> PAGEREF _Toc1219781540 \h </w:instrText>
-      </w:r>
-      <w:r>
-        <w:fldChar w:fldCharType="separate"/>
-      </w:r>
-      <w:r>
-        <w:t>15</w:t>
+        <w:instrText xml:space="preserve"> PAGEREF _Toc1231872847 \h </w:instrText>
+      </w:r>
+      <w:r>
+        <w:fldChar w:fldCharType="separate"/>
+      </w:r>
+      <w:r>
+        <w:t>13</w:t>
       </w:r>
       <w:r>
         <w:fldChar w:fldCharType="end"/>
@@ -2124,6 +2165,47 @@
         <w:fldChar w:fldCharType="begin"/>
       </w:r>
       <w:r>
+        <w:instrText xml:space="preserve"> HYPERLINK \l _Toc1219781540 </w:instrText>
+      </w:r>
+      <w:r>
+        <w:fldChar w:fldCharType="separate"/>
+      </w:r>
+      <w:r>
+        <w:t>Hình 11 . Lập chỉ mục, đồng bộ và tính PageRank</w:t>
+      </w:r>
+      <w:r>
+        <w:tab/>
+      </w:r>
+      <w:r>
+        <w:fldChar w:fldCharType="begin"/>
+      </w:r>
+      <w:r>
+        <w:instrText xml:space="preserve"> PAGEREF _Toc1219781540 \h </w:instrText>
+      </w:r>
+      <w:r>
+        <w:fldChar w:fldCharType="separate"/>
+      </w:r>
+      <w:r>
+        <w:t>15</w:t>
+      </w:r>
+      <w:r>
+        <w:fldChar w:fldCharType="end"/>
+      </w:r>
+      <w:r>
+        <w:fldChar w:fldCharType="end"/>
+      </w:r>
+    </w:p>
+    <w:p>
+      <w:pPr>
+        <w:pStyle w:val="23"/>
+        <w:tabs>
+          <w:tab w:val="right" w:leader="dot" w:pos="9355"/>
+        </w:tabs>
+      </w:pPr>
+      <w:r>
+        <w:fldChar w:fldCharType="begin"/>
+      </w:r>
+      <w:r>
         <w:instrText xml:space="preserve"> HYPERLINK \l _Toc1695363305 </w:instrText>
       </w:r>
       <w:r>
@@ -2140,6 +2222,47 @@
       </w:r>
       <w:r>
         <w:instrText xml:space="preserve"> PAGEREF _Toc1695363305 \h </w:instrText>
+      </w:r>
+      <w:r>
+        <w:fldChar w:fldCharType="separate"/>
+      </w:r>
+      <w:r>
+        <w:t>16</w:t>
+      </w:r>
+      <w:r>
+        <w:fldChar w:fldCharType="end"/>
+      </w:r>
+      <w:r>
+        <w:fldChar w:fldCharType="end"/>
+      </w:r>
+    </w:p>
+    <w:p>
+      <w:pPr>
+        <w:pStyle w:val="23"/>
+        <w:tabs>
+          <w:tab w:val="right" w:leader="dot" w:pos="9355"/>
+        </w:tabs>
+      </w:pPr>
+      <w:r>
+        <w:fldChar w:fldCharType="begin"/>
+      </w:r>
+      <w:r>
+        <w:instrText xml:space="preserve"> HYPERLINK \l _Toc9300013 </w:instrText>
+      </w:r>
+      <w:r>
+        <w:fldChar w:fldCharType="separate"/>
+      </w:r>
+      <w:r>
+        <w:t>Hình 13 . Ẩn kết quả trùng lặp</w:t>
+      </w:r>
+      <w:r>
+        <w:tab/>
+      </w:r>
+      <w:r>
+        <w:fldChar w:fldCharType="begin"/>
+      </w:r>
+      <w:r>
+        <w:instrText xml:space="preserve"> PAGEREF _Toc9300013 \h </w:instrText>
       </w:r>
       <w:r>
         <w:fldChar w:fldCharType="separate"/>
@@ -4386,7 +4509,7 @@
                 <w:sz w:val="22"/>
                 <w:szCs w:val="22"/>
               </w:rPr>
-              <w:t>15,7 giây tính, 2,2 giây ghi</w:t>
+              <w:t xml:space="preserve">18,3 giây tính, 1,7 giây ghi</w:t>
             </w:r>
           </w:p>
         </w:tc>
@@ -5181,7 +5304,7 @@
         <w:jc w:val="both"/>
       </w:pPr>
       <w:r>
-        <w:t>PageRank được tính trên đồ thị liên kết, chỉ giữ liên kết giữa hai site khác nhau. Phần lớn liên kết nằm trong cùng một site, như menu, chân trang, phân trang; nếu tính cả, các trang điều hướng của thư viện số dlib.hust.edu.vn chiếm hết các vị trí đầu. Bộ dữ liệu nộp còn 174.368 liên kết khác site, và PageRank hội tụ sau 37 vòng lặp với xác suất nhảy ngẫu nhiên 0,1. Điểm được chuẩn hoá về khoảng 0 đến 1 theo thang logarit. Đứng đầu là trang chủ thư viện, hust.edu.vn, svbk.hust.edu.vn, csv.hust.edu.vn, rồi đến các thông báo tuyển sinh của ts.hust.edu.vn. Chỉ 1.147 trang có liên kết từ site khác trỏ tới; các trang còn lại có điểm 0, nên PageRank chỉ nâng một nhóm nhỏ trang được nhiều site dẫn lại.</w:t>
+        <w:t xml:space="preserve">PageRank được tính trên đồ thị liên kết sau khi bỏ các liên kết khuôn mẫu. Khoảng 96% liên kết nằm trong cùng một site, phần lớn là menu, chân trang và phân trang; nếu tính hết, các trang điều hướng của thư viện số dlib.hust.edu.vn chiếm hết các vị trí đầu. Liên kết giữa hai site khác nhau được giữ hết. Liên kết trong cùng một site bị bỏ khi trang đích được hơn 20 trang cùng site trỏ tới, với site nhỏ thì hơn 5% số trang của site nhưng không dưới 5 trang, hoặc khi trang đích là trang phân trang, trang danh sách theo chủ đề hay tác giả. Liên kết còn lại thường nằm trong thân bài và mục tin liên quan. Ngưỡng 20 được chọn vì menu riêng của một chuyên mục chỉ có trên vài chục trang: với ngưỡng 50, nhóm trang Giới thiệu của thư viện trỏ vòng lẫn nhau và chiếm các vị trí đầu. Trên bộ dữ liệu nộp, đồ thị giữ 174.368 liên kết khác site và 300.362 liên kết cùng site, bỏ 4.143.487 liên kết khuôn mẫu. PageRank hội tụ sau 171 vòng lặp với xác suất nhảy ngẫu nhiên 0,1, rồi được chuẩn hoá về khoảng 0 đến 1 theo thang logarit. Đứng đầu là trang chủ thư viện, hust.edu.vn và svbk.hust.edu.vn, tiếp theo là các bài tin được trang chủ hust.edu.vn giới thiệu. 83.333 trang và tệp có điểm lớn hơn 0; nếu chỉ dùng liên kết khác site như cách tính ban đầu thì con số này là 1.147.</w:t>
       </w:r>
     </w:p>
     <w:p>
@@ -5194,7 +5317,7 @@
       <w:r>
         <w:drawing>
           <wp:inline distT="0" distB="0" distL="0" distR="0">
-            <wp:extent cx="5940425" cy="4112895"/>
+            <wp:extent cx="5940425" cy="4048150"/>
             <wp:effectExtent l="0" t="0" r="0" b="0"/>
             <wp:docPr id="2003" name="Hinh 2003" descr="Lập chỉ mục, đồng bộ và tính PageRank"/>
             <wp:cNvGraphicFramePr>
@@ -5218,7 +5341,7 @@
                   <pic:spPr>
                     <a:xfrm>
                       <a:off x="0" y="0"/>
-                      <a:ext cx="5940425" cy="4113337"/>
+                      <a:ext cx="5940425" cy="4048150"/>
                     </a:xfrm>
                     <a:prstGeom prst="rect">
                       <a:avLst/>
@@ -5621,7 +5744,7 @@
         <w:jc w:val="both"/>
       </w:pPr>
       <w:r>
-        <w:t>Truy vấn được mở rộng bằng từ điển viết tắt của trường, chẳng hạn ktx thêm "ký túc xá", cntt thêm "công nghệ thông tin". Lucene xếp hạng bằng BM25, rồi điểm được nhân thêm theo PageRank. Điểm BM25 dao động từ vài đơn vị tới vài trăm tuỳ truy vấn, nên phép nhân giữ tác động của PageRank theo tỉ lệ. Trước khi in, chương trình ẩn kết quả gần trùng với một kết quả xếp trên: mỗi kết quả được biểu diễn bằng tập chuỗi bốn từ liên tiếp, độ giống nhau ước lượng bằng MinHash, ngưỡng hệ số Jaccard là 0,9.</w:t>
+        <w:t xml:space="preserve">Truy vấn được mở rộng bằng từ điển viết tắt của trường, chẳng hạn ktx thêm &amp;quot;ký túc xá&amp;quot;, cntt thêm &amp;quot;công nghệ thông tin&amp;quot;. Lucene xếp hạng bằng BM25, rồi điểm được nhân thêm theo PageRank. Điểm BM25 dao động từ vài đơn vị tới vài trăm tuỳ truy vấn, nên phép nhân giữ tác động của PageRank theo tỉ lệ. Trước khi in, chương trình ẩn các kết quả trùng lặp theo cách ở mục 3.4.</w:t>
       </w:r>
     </w:p>
     <w:p>
@@ -5714,6 +5837,115 @@
     </w:p>
     <w:p>
       <w:pPr>
+        <w:pStyle w:val="4"/>
+        <w:spacing w:before="120" w:after="120"/>
+      </w:pPr>
+      <w:bookmarkStart w:id="61" w:name="_Toc9300034"/>
+      <w:r>
+        <w:t>3.4. Ẩn kết quả trùng lặp</w:t>
+      </w:r>
+      <w:bookmarkEnd w:id="61"/>
+    </w:p>
+    <w:p>
+      <w:pPr>
+        <w:pStyle w:val="3"/>
+        <w:spacing w:before="120" w:after="120"/>
+        <w:jc w:val="both"/>
+      </w:pPr>
+      <w:r>
+        <w:t xml:space="preserve">Cùng một bài thường có mặt ở nhiều địa chỉ: bản tiếng Việt và bản tiếng Anh của một trang tin, bản in ở đường dẫn savefile, bản đăng lại trên site của khoa. Crawler đã gộp các trang trùng mã băm nội dung, nhưng các bản này khác nhau ở menu, ngày giờ và mục tin liên quan nên vẫn vào chỉ mục như những tài liệu riêng. Nếu không xử lý, một bài có thể chiếm ba trong mười vị trí đầu.</w:t>
+      </w:r>
+    </w:p>
+    <w:p>
+      <w:pPr>
+        <w:pStyle w:val="3"/>
+        <w:spacing w:before="120" w:after="120"/>
+        <w:jc w:val="both"/>
+      </w:pPr>
+      <w:r>
+        <w:t xml:space="preserve">Mỗi kết quả được biểu diễn bằng tập chuỗi bốn từ liên tiếp trong nội dung. Độ giống nhau của hai kết quả là hệ số Jaccard của hai tập, ước lượng nhanh bằng MinHash với 128 hàm băm. Chương trình xét kết quả theo thứ tự xếp hạng và ẩn kết quả trùng với một kết quả đã giữ phía trên (Hình 13). Chỉ dùng độ giống thì không đủ: nội dung lưu cả khung trang, nên ba bản của cùng một bài chỉ giống nhau từ 0,3 đến 0,86, trong khi hai bài khác nhau trên cùng một site có thể giống tới 0,8. Vì vậy, ngoài trường hợp giống nhau từ 0,9, hai kết quả còn bị coi là trùng khi cùng tiêu đề và thêm một trong hai điều kiện: cùng đoạn cuối đường dẫn sau khi bỏ đuôi .html và mã số bài, hoặc giống nhau từ 0,6. Chương trình lấy dư ứng viên để sau khi ẩn vẫn đủ số kết quả cần hiện, và báo số kết quả đã ẩn.</w:t>
+      </w:r>
+    </w:p>
+    <w:p>
+      <w:pPr>
+        <w:pStyle w:val="50"/>
+        <w:keepNext/>
+        <w:spacing w:after="0"/>
+        <w:jc w:val="center"/>
+      </w:pPr>
+      <w:r>
+        <w:drawing>
+          <wp:inline distT="0" distB="0" distL="0" distR="0">
+            <wp:extent cx="5940425" cy="5484417"/>
+            <wp:effectExtent l="0" t="0" r="0" b="0"/>
+            <wp:docPr id="2010" name="Hinh 2010" descr="Ẩn kết quả trùng lặp"/>
+            <wp:cNvGraphicFramePr>
+              <a:graphicFrameLocks xmlns:a="http://schemas.openxmlformats.org/drawingml/2006/main" noChangeAspect="1"/>
+            </wp:cNvGraphicFramePr>
+            <a:graphic xmlns:a="http://schemas.openxmlformats.org/drawingml/2006/main">
+              <a:graphicData uri="http://schemas.openxmlformats.org/drawingml/2006/picture">
+                <pic:pic xmlns:pic="http://schemas.openxmlformats.org/drawingml/2006/picture">
+                  <pic:nvPicPr>
+                    <pic:cNvPr id="2010" name="Hinh 2010" descr="Ẩn kết quả trùng lặp"/>
+                    <pic:cNvPicPr>
+                      <a:picLocks noChangeAspect="1"/>
+                    </pic:cNvPicPr>
+                  </pic:nvPicPr>
+                  <pic:blipFill>
+                    <a:blip r:embed="rId40"/>
+                    <a:stretch>
+                      <a:fillRect/>
+                    </a:stretch>
+                  </pic:blipFill>
+                  <pic:spPr>
+                    <a:xfrm>
+                      <a:off x="0" y="0"/>
+                      <a:ext cx="5940425" cy="5484417"/>
+                    </a:xfrm>
+                    <a:prstGeom prst="rect">
+                      <a:avLst/>
+                    </a:prstGeom>
+                    <a:noFill/>
+                  </pic:spPr>
+                </pic:pic>
+              </a:graphicData>
+            </a:graphic>
+          </wp:inline>
+        </w:drawing>
+      </w:r>
+    </w:p>
+    <w:p>
+      <w:pPr>
+        <w:pStyle w:val="48"/>
+        <w:spacing w:before="120"/>
+        <w:jc w:val="center"/>
+      </w:pPr>
+      <w:r>
+        <w:t xml:space="preserve">Hình </w:t>
+      </w:r>
+      <w:r>
+        <w:fldChar w:fldCharType="begin"/>
+      </w:r>
+      <w:r>
+        <w:instrText xml:space="preserve"> SEQ Hình \* ARABIC </w:instrText>
+      </w:r>
+      <w:r>
+        <w:fldChar w:fldCharType="separate"/>
+      </w:r>
+      <w:r>
+        <w:t>13</w:t>
+      </w:r>
+      <w:r>
+        <w:fldChar w:fldCharType="end"/>
+      </w:r>
+      <w:bookmarkStart w:id="62" w:name="_Toc9300013"/>
+      <w:r>
+        <w:t>. Ẩn kết quả trùng lặp</w:t>
+      </w:r>
+      <w:bookmarkEnd w:id="62"/>
+    </w:p>
+    <w:p>
+      <w:pPr>
         <w:pStyle w:val="2"/>
         <w:pageBreakBefore/>
         <w:spacing w:before="120" w:after="120"/>
@@ -6849,7 +7081,7 @@
                 <w:sz w:val="22"/>
                 <w:szCs w:val="22"/>
               </w:rPr>
-              <w:t>Liên kết khác site dùng cho PageRank</w:t>
+              <w:t xml:space="preserve">Liên kết dùng cho PageRank</w:t>
             </w:r>
           </w:p>
         </w:tc>
@@ -6869,7 +7101,7 @@
                 <w:sz w:val="22"/>
                 <w:szCs w:val="22"/>
               </w:rPr>
-              <w:t>174.368</w:t>
+              <w:t xml:space="preserve">174.368 khác site, 300.362 cùng site</w:t>
             </w:r>
           </w:p>
         </w:tc>
@@ -6894,7 +7126,7 @@
                 <w:sz w:val="22"/>
                 <w:szCs w:val="22"/>
               </w:rPr>
-              <w:t>Trang có PageRank lớn hơn 0</w:t>
+              <w:t xml:space="preserve">Trang, tệp có PageRank lớn hơn 0</w:t>
             </w:r>
           </w:p>
         </w:tc>
@@ -6914,7 +7146,7 @@
                 <w:sz w:val="22"/>
                 <w:szCs w:val="22"/>
               </w:rPr>
-              <w:t>1.147</w:t>
+              <w:t xml:space="preserve">83.333</w:t>
             </w:r>
           </w:p>
         </w:tc>
@@ -6993,7 +7225,7 @@
           <w:sz w:val="22"/>
           <w:szCs w:val="22"/>
         </w:rPr>
-        <w:t>Truy vấn: tuyển sinh đại học chính quy, 52.981 tài liệu khớp</w:t>
+        <w:t xml:space="preserve">Truy vấn: tuyển sinh đại học chính quy, 52.981 tài liệu khớp, ẩn 8 kết quả trùng</w:t>
       </w:r>
     </w:p>
     <w:p>
@@ -7013,7 +7245,7 @@
           <w:sz w:val="22"/>
           <w:szCs w:val="22"/>
         </w:rPr>
-        <w:t>1. Điểm 109,04, PageRank 0,11: Thông tin Tuyển sinh Đại học chính quy năm 2026</w:t>
+        <w:t xml:space="preserve">1. Điểm 111,61, PageRank 0,21: Dự kiến phương thức tuyển sinh đại học chính quy năm 2023</w:t>
       </w:r>
     </w:p>
     <w:p>
@@ -7033,7 +7265,7 @@
           <w:sz w:val="22"/>
           <w:szCs w:val="22"/>
         </w:rPr>
-        <w:t xml:space="preserve">   ts.hust.edu.vn/tin-tuc/thong-tin-tuyen-sinh-dai-hoc-chinh-quy-nam-2026</w:t>
+        <w:t xml:space="preserve">   fed.hust.edu.vn/vi/news/tin-tuc/du-kien-phuong-thuc-...-nam-2023-293225.html</w:t>
       </w:r>
     </w:p>
     <w:p>
@@ -7053,7 +7285,7 @@
           <w:sz w:val="22"/>
           <w:szCs w:val="22"/>
         </w:rPr>
-        <w:t>2. Điểm 105,11: Điểm chuẩn tuyển sinh đại học chính quy 2018</w:t>
+        <w:t xml:space="preserve">2. Điểm 110,94, PageRank 0,15: Thông tin tuyển sinh Đại học chính quy năm 2024</w:t>
       </w:r>
     </w:p>
     <w:p>
@@ -7073,7 +7305,7 @@
           <w:sz w:val="22"/>
           <w:szCs w:val="22"/>
         </w:rPr>
-        <w:t xml:space="preserve">   ts.hust.edu.vn/tin-tuc/diem-chuan-tuyen-sinh-dai-hoc-chinh-quy-2018</w:t>
+        <w:t xml:space="preserve">   ts.hust.edu.vn/tin-tuc/thong-tin-tuyen-sinh-dai-hoc-chinh-quy-nam-2024</w:t>
       </w:r>
     </w:p>
     <w:p>
@@ -7093,7 +7325,7 @@
           <w:sz w:val="22"/>
           <w:szCs w:val="22"/>
         </w:rPr>
-        <w:t>3. Điểm 103,44: Thông tin tuyển sinh Đại học chính quy năm 2024</w:t>
+        <w:t xml:space="preserve">3. Điểm 109,34, PageRank 0,12: Thông tin Tuyển sinh Đại học chính quy năm 2026</w:t>
       </w:r>
     </w:p>
     <w:p>
@@ -7113,7 +7345,7 @@
           <w:sz w:val="22"/>
           <w:szCs w:val="22"/>
         </w:rPr>
-        <w:t xml:space="preserve">   ts.hust.edu.vn/tin-tuc/thong-tin-tuyen-sinh-dai-hoc-chinh-quy-nam-2024</w:t>
+        <w:t xml:space="preserve">   ts.hust.edu.vn/tin-tuc/thong-tin-tuyen-sinh-dai-hoc-chinh-quy-nam-2026</w:t>
       </w:r>
     </w:p>
     <w:p>
@@ -7123,7 +7355,7 @@
         <w:jc w:val="both"/>
       </w:pPr>
       <w:r>
-        <w:t>Thông báo năm 2026 đứng đầu vì được các site khác trỏ tới. Trên 20 truy vấn về tuyển sinh, học bổng, ký túc xá, thực tập và thư viện, PageRank đổi thứ tự top 10 ở 3 truy vấn; trung bình 9,8 trên 10 kết quả vẫn giữ nguyên. Truy vấn "ktx" trả về 663 tài liệu nhờ được thêm "ký túc xá", đứng đầu là trang Ký túc xá của hust.edu.vn. Hai truy vấn gõ sai "điểm chuẩm" và "học bổnh" không có kết quả nào và được gợi ý "điểm chuẩn" với 1.212 văn bản, "học bổng" với 6.027 văn bản. Gợi ý có thể sai khi cụm đúng cũng hiếm: "sử lý ảnh số" được gợi ý thành "so lý ảnh số".</w:t>
+        <w:t xml:space="preserve">Ba kết quả đầu là thông tin tuyển sinh đại học chính quy của các năm, 8 kết quả trùng với kết quả xếp trên đã bị ẩn. Trên 20 truy vấn về tuyển sinh, học bổng, ký túc xá, thực tập và thư viện, PageRank đổi thứ tự top 10 ở cả 20 truy vấn, nhưng trung bình 8,9 trên 10 kết quả vẫn giữ nguyên. Với cách tính ban đầu chỉ dùng liên kết khác site, PageRank chỉ đổi thứ tự ở 6 truy vấn, vì 186 trên 200 kết quả có điểm 0. Điểm yếu là các thông báo hành chính được trang chủ hust.edu.vn đưa lên cũng có PageRank cao: thông báo mời báo giá phần mềm thi trực tuyến có điểm 0,59 và lên vị trí thứ hai của truy vấn "bài thi đánh giá tư duy". Truy vấn "ktx" trả về 663 tài liệu nhờ được thêm "ký túc xá", đứng đầu là trang Ký túc xá của hust.edu.vn. Hai truy vấn gõ sai "điểm chuẩm" và "học bổnh" không có kết quả nào và được gợi ý "điểm chuẩn" với 1.212 văn bản, "học bổng" với 6.027 văn bản. Gợi ý có thể sai khi cụm đúng cũng hiếm: "sử lý ảnh số" được gợi ý thành "so lý ảnh số".</w:t>
       </w:r>
     </w:p>
     <w:p>
@@ -7470,6 +7702,352 @@
       </w:pPr>
       <w:r>
         <w:t>Để thử đồng bộ, 10% bản ghi được tách khỏi MongoDB rồi đưa lại theo từng đợt như crawler vừa ghi. Một đợt 161 bản ghi được đồng bộ trong 1,1 giây: 122 bản ghi vào chỉ mục, số còn lại là trang trùng nội dung hoặc rỗng nên bị bỏ qua. Đưa lại đúng đợt đó thì 122 bản ghi được nhận ra là không đổi trong 0,1 giây. Trang mới tìm thấy được ngay trong phiên tìm kiếm đang mở.</w:t>
+      </w:r>
+    </w:p>
+    <w:p>
+      <w:pPr>
+        <w:pStyle w:val="3"/>
+        <w:spacing w:before="120" w:after="120"/>
+        <w:jc w:val="both"/>
+      </w:pPr>
+      <w:r>
+        <w:t xml:space="preserve">Để đo tác dụng của việc ẩn trùng, nhóm chạy lại 20 truy vấn trên với hai cách: chỉ so độ giống từ 0,9 như ban đầu, và thêm điều kiện tiêu đề, đường dẫn ở mục 3.4 (Bảng 10). Bản sao của cùng một bài là kết quả có cùng tiêu đề và cùng đoạn cuối đường dẫn với một kết quả xếp trên.</w:t>
+      </w:r>
+    </w:p>
+    <w:p>
+      <w:pPr>
+        <w:pStyle w:val="47"/>
+        <w:keepNext/>
+        <w:spacing w:before="120"/>
+        <w:jc w:val="center"/>
+      </w:pPr>
+      <w:r>
+        <w:t xml:space="preserve">Bảng </w:t>
+      </w:r>
+      <w:r>
+        <w:fldChar w:fldCharType="begin"/>
+      </w:r>
+      <w:r>
+        <w:instrText xml:space="preserve"> SEQ Bảng \* ARABIC </w:instrText>
+      </w:r>
+      <w:r>
+        <w:fldChar w:fldCharType="separate"/>
+      </w:r>
+      <w:r>
+        <w:t>10</w:t>
+      </w:r>
+      <w:r>
+        <w:fldChar w:fldCharType="end"/>
+      </w:r>
+      <w:bookmarkStart w:id="63" w:name="_Toc9300010"/>
+      <w:r>
+        <w:t>. Kết quả trùng lặp trong top 10 của 20 truy vấn</w:t>
+      </w:r>
+      <w:bookmarkEnd w:id="63"/>
+    </w:p>
+    <w:tbl>
+      <w:tblPr>
+        <w:tblStyle w:val="44"/>
+        <w:tblW w:w="9355" w:type="dxa"/>
+        <w:jc w:val="center"/>
+        <w:tblBorders>
+          <w:top w:val="single" w:color="000000" w:sz="4" w:space="0"/>
+          <w:left w:val="single" w:color="000000" w:sz="4" w:space="0"/>
+          <w:bottom w:val="single" w:color="000000" w:sz="4" w:space="0"/>
+          <w:right w:val="single" w:color="000000" w:sz="4" w:space="0"/>
+          <w:insideH w:val="single" w:color="000000" w:sz="4" w:space="0"/>
+          <w:insideV w:val="single" w:color="000000" w:sz="4" w:space="0"/>
+        </w:tblBorders>
+        <w:tblLayout w:type="fixed"/>
+        <w:tblCellMar>
+          <w:top w:w="0" w:type="dxa"/>
+          <w:left w:w="100" w:type="dxa"/>
+          <w:bottom w:w="0" w:type="dxa"/>
+          <w:right w:w="100" w:type="dxa"/>
+        </w:tblCellMar>
+      </w:tblPr>
+      <w:tblGrid>
+        <w:gridCol w:w="3155"/>
+        <w:gridCol w:w="3100"/>
+        <w:gridCol w:w="3100"/>
+      </w:tblGrid>
+      <w:tr>
+        <w:trPr>
+          <w:cantSplit/>
+          <w:tblHeader/>
+          <w:jc w:val="center"/>
+        </w:trPr>
+        <w:tc>
+          <w:tcPr>
+            <w:tcW w:w="3155" w:type="dxa"/>
+            <w:vAlign w:val="center"/>
+          </w:tcPr>
+          <w:p>
+            <w:pPr>
+              <w:pStyle w:val="27"/>
+              <w:spacing w:before="40" w:after="40" w:line="276" w:lineRule="auto"/>
+              <w:jc w:val="center"/>
+            </w:pPr>
+            <w:r>
+              <w:rPr>
+                <w:b/>
+                <w:sz w:val="22"/>
+                <w:szCs w:val="22"/>
+              </w:rPr>
+              <w:t xml:space="preserve">Chỉ số</w:t>
+            </w:r>
+          </w:p>
+        </w:tc>
+        <w:tc>
+          <w:tcPr>
+            <w:tcW w:w="3100" w:type="dxa"/>
+            <w:vAlign w:val="center"/>
+          </w:tcPr>
+          <w:p>
+            <w:pPr>
+              <w:pStyle w:val="27"/>
+              <w:spacing w:before="40" w:after="40" w:line="276" w:lineRule="auto"/>
+              <w:jc w:val="center"/>
+            </w:pPr>
+            <w:r>
+              <w:rPr>
+                <w:b/>
+                <w:sz w:val="22"/>
+                <w:szCs w:val="22"/>
+              </w:rPr>
+              <w:t xml:space="preserve">Chỉ so độ giống từ 0,9</w:t>
+            </w:r>
+          </w:p>
+        </w:tc>
+        <w:tc>
+          <w:tcPr>
+            <w:tcW w:w="3100" w:type="dxa"/>
+            <w:vAlign w:val="center"/>
+          </w:tcPr>
+          <w:p>
+            <w:pPr>
+              <w:pStyle w:val="27"/>
+              <w:spacing w:before="40" w:after="40" w:line="276" w:lineRule="auto"/>
+              <w:jc w:val="center"/>
+            </w:pPr>
+            <w:r>
+              <w:rPr>
+                <w:b/>
+                <w:sz w:val="22"/>
+                <w:szCs w:val="22"/>
+              </w:rPr>
+              <w:t xml:space="preserve">Thêm điều kiện tiêu đề, đường dẫn</w:t>
+            </w:r>
+          </w:p>
+        </w:tc>
+      </w:tr>
+      <w:tr>
+        <w:trPr>
+          <w:cantSplit/>
+          <w:jc w:val="center"/>
+        </w:trPr>
+        <w:tc>
+          <w:tcPr>
+            <w:tcW w:w="3155" w:type="dxa"/>
+            <w:vAlign w:val="center"/>
+          </w:tcPr>
+          <w:p>
+            <w:pPr>
+              <w:pStyle w:val="27"/>
+              <w:spacing w:before="40" w:after="40" w:line="276" w:lineRule="auto"/>
+              <w:jc w:val="center"/>
+            </w:pPr>
+            <w:r>
+              <w:rPr>
+                <w:sz w:val="22"/>
+                <w:szCs w:val="22"/>
+              </w:rPr>
+              <w:t xml:space="preserve">Kết quả bị ẩn để đủ 10 kết quả</w:t>
+            </w:r>
+          </w:p>
+        </w:tc>
+        <w:tc>
+          <w:tcPr>
+            <w:tcW w:w="3100" w:type="dxa"/>
+            <w:vAlign w:val="center"/>
+          </w:tcPr>
+          <w:p>
+            <w:pPr>
+              <w:pStyle w:val="27"/>
+              <w:spacing w:before="40" w:after="40" w:line="276" w:lineRule="auto"/>
+              <w:jc w:val="center"/>
+            </w:pPr>
+            <w:r>
+              <w:rPr>
+                <w:sz w:val="22"/>
+                <w:szCs w:val="22"/>
+              </w:rPr>
+              <w:t xml:space="preserve">5</w:t>
+            </w:r>
+          </w:p>
+        </w:tc>
+        <w:tc>
+          <w:tcPr>
+            <w:tcW w:w="3100" w:type="dxa"/>
+            <w:vAlign w:val="center"/>
+          </w:tcPr>
+          <w:p>
+            <w:pPr>
+              <w:pStyle w:val="27"/>
+              <w:spacing w:before="40" w:after="40" w:line="276" w:lineRule="auto"/>
+              <w:jc w:val="center"/>
+            </w:pPr>
+            <w:r>
+              <w:rPr>
+                <w:sz w:val="22"/>
+                <w:szCs w:val="22"/>
+              </w:rPr>
+              <w:t xml:space="preserve">56</w:t>
+            </w:r>
+          </w:p>
+        </w:tc>
+      </w:tr>
+      <w:tr>
+        <w:trPr>
+          <w:cantSplit/>
+          <w:jc w:val="center"/>
+        </w:trPr>
+        <w:tc>
+          <w:tcPr>
+            <w:tcW w:w="3155" w:type="dxa"/>
+            <w:vAlign w:val="center"/>
+          </w:tcPr>
+          <w:p>
+            <w:pPr>
+              <w:pStyle w:val="27"/>
+              <w:spacing w:before="40" w:after="40" w:line="276" w:lineRule="auto"/>
+              <w:jc w:val="center"/>
+            </w:pPr>
+            <w:r>
+              <w:rPr>
+                <w:sz w:val="22"/>
+                <w:szCs w:val="22"/>
+              </w:rPr>
+              <w:t xml:space="preserve">Bản sao của cùng một bài còn trong top 10</w:t>
+            </w:r>
+          </w:p>
+        </w:tc>
+        <w:tc>
+          <w:tcPr>
+            <w:tcW w:w="3100" w:type="dxa"/>
+            <w:vAlign w:val="center"/>
+          </w:tcPr>
+          <w:p>
+            <w:pPr>
+              <w:pStyle w:val="27"/>
+              <w:spacing w:before="40" w:after="40" w:line="276" w:lineRule="auto"/>
+              <w:jc w:val="center"/>
+            </w:pPr>
+            <w:r>
+              <w:rPr>
+                <w:sz w:val="22"/>
+                <w:szCs w:val="22"/>
+              </w:rPr>
+              <w:t xml:space="preserve">29</w:t>
+            </w:r>
+          </w:p>
+        </w:tc>
+        <w:tc>
+          <w:tcPr>
+            <w:tcW w:w="3100" w:type="dxa"/>
+            <w:vAlign w:val="center"/>
+          </w:tcPr>
+          <w:p>
+            <w:pPr>
+              <w:pStyle w:val="27"/>
+              <w:spacing w:before="40" w:after="40" w:line="276" w:lineRule="auto"/>
+              <w:jc w:val="center"/>
+            </w:pPr>
+            <w:r>
+              <w:rPr>
+                <w:sz w:val="22"/>
+                <w:szCs w:val="22"/>
+              </w:rPr>
+              <w:t xml:space="preserve">0</w:t>
+            </w:r>
+          </w:p>
+        </w:tc>
+      </w:tr>
+      <w:tr>
+        <w:trPr>
+          <w:cantSplit/>
+          <w:jc w:val="center"/>
+        </w:trPr>
+        <w:tc>
+          <w:tcPr>
+            <w:tcW w:w="3155" w:type="dxa"/>
+            <w:vAlign w:val="center"/>
+          </w:tcPr>
+          <w:p>
+            <w:pPr>
+              <w:pStyle w:val="27"/>
+              <w:spacing w:before="40" w:after="40" w:line="276" w:lineRule="auto"/>
+              <w:jc w:val="center"/>
+            </w:pPr>
+            <w:r>
+              <w:rPr>
+                <w:sz w:val="22"/>
+                <w:szCs w:val="22"/>
+              </w:rPr>
+              <w:t xml:space="preserve">Kết quả trùng tiêu đề với một kết quả xếp trên</w:t>
+            </w:r>
+          </w:p>
+        </w:tc>
+        <w:tc>
+          <w:tcPr>
+            <w:tcW w:w="3100" w:type="dxa"/>
+            <w:vAlign w:val="center"/>
+          </w:tcPr>
+          <w:p>
+            <w:pPr>
+              <w:pStyle w:val="27"/>
+              <w:spacing w:before="40" w:after="40" w:line="276" w:lineRule="auto"/>
+              <w:jc w:val="center"/>
+            </w:pPr>
+            <w:r>
+              <w:rPr>
+                <w:sz w:val="22"/>
+                <w:szCs w:val="22"/>
+              </w:rPr>
+              <w:t xml:space="preserve">37</w:t>
+            </w:r>
+          </w:p>
+        </w:tc>
+        <w:tc>
+          <w:tcPr>
+            <w:tcW w:w="3100" w:type="dxa"/>
+            <w:vAlign w:val="center"/>
+          </w:tcPr>
+          <w:p>
+            <w:pPr>
+              <w:pStyle w:val="27"/>
+              <w:spacing w:before="40" w:after="40" w:line="276" w:lineRule="auto"/>
+              <w:jc w:val="center"/>
+            </w:pPr>
+            <w:r>
+              <w:rPr>
+                <w:sz w:val="22"/>
+                <w:szCs w:val="22"/>
+              </w:rPr>
+              <w:t xml:space="preserve">7</w:t>
+            </w:r>
+          </w:p>
+        </w:tc>
+      </w:tr>
+    </w:tbl>
+    <w:p>
+      <w:pPr>
+        <w:pStyle w:val="3"/>
+        <w:spacing w:before="120" w:after="120"/>
+        <w:jc w:val="both"/>
+      </w:pPr>
+      <w:r>
+        <w:t xml:space="preserve">Với truy vấn "tuyển sinh thạc sĩ", cách cũ để bài "Thông báo Tuyển sinh Thạc sĩ Đợt 1.2020" chiếm vị trí 1, 3 và 5, ở ba địa chỉ /tin-tuc/, /en/tin-tuc/ và /en/news/ của ts.hust.edu.vn; ba bản chỉ giống nhau 0,84 và 0,86 nên không bị ẩn. Cách mới giữ một bản và đưa ba bài khác lên. Bảy kết quả còn trùng tiêu đề là các trang khác nhau có tiêu đề chung, như trang "Học phí" của nhiều đơn vị, nên được giữ. Chỉ một cặp bị ẩn nhờ điều kiện giống nhau từ 0,6 mà không cùng đường dẫn; kiểm tra lại thì đó đúng là một bài về học bổng ABB của sme.hust.edu.vn đăng ở hai chuyên mục.</w:t>
       </w:r>
     </w:p>
     <w:sectPr>

</xml_diff>